<commit_message>
Update upgrade guide and fix documentation issues
- add upgrade instructions for removing obsolete files
- fix typos in manuals
- remove extra spaces from install-agent.sh error messages
</commit_message>
<xml_diff>
--- a/doc/ja/zabbix_management_manual.docx
+++ b/doc/ja/zabbix_management_manual.docx
@@ -245,7 +245,7 @@
         <w:rPr>
           <w:rFonts w:hint="eastAsia"/>
         </w:rPr>
-        <w:t>07</w:t>
+        <w:t>28</w:t>
       </w:r>
       <w:r>
         <w:rPr>
@@ -1045,7 +1045,13 @@
               <w:rPr>
                 <w:rFonts w:hint="eastAsia"/>
               </w:rPr>
-              <w:t>2026/10/07</w:t>
+              <w:t>2026/10/</w:t>
+            </w:r>
+            <w:r>
+              <w:rPr>
+                <w:rFonts w:hint="eastAsia"/>
+              </w:rPr>
+              <w:t>28</w:t>
             </w:r>
           </w:p>
         </w:tc>
@@ -1619,7 +1625,7 @@
         </w:rPr>
         <w:fldChar w:fldCharType="separate"/>
       </w:r>
-      <w:hyperlink w:anchor="_Toc242172361" w:history="1">
+      <w:hyperlink w:anchor="_Toc244091345" w:history="1">
         <w:r>
           <w:rPr>
             <w:rStyle w:val="ab"/>
@@ -1663,7 +1669,7 @@
             <w:noProof/>
             <w:webHidden/>
           </w:rPr>
-          <w:instrText xml:space="preserve"> PAGEREF _Toc242172361 \h </w:instrText>
+          <w:instrText xml:space="preserve"> PAGEREF _Toc244091345 \h </w:instrText>
         </w:r>
         <w:r>
           <w:rPr>
@@ -1709,7 +1715,7 @@
           <w14:ligatures w14:val="standardContextual"/>
         </w:rPr>
       </w:pPr>
-      <w:hyperlink w:anchor="_Toc242172362" w:history="1">
+      <w:hyperlink w:anchor="_Toc244091346" w:history="1">
         <w:r>
           <w:rPr>
             <w:rStyle w:val="ab"/>
@@ -1774,7 +1780,7 @@
             <w:noProof/>
             <w:webHidden/>
           </w:rPr>
-          <w:instrText xml:space="preserve"> PAGEREF _Toc242172362 \h </w:instrText>
+          <w:instrText xml:space="preserve"> PAGEREF _Toc244091346 \h </w:instrText>
         </w:r>
         <w:r>
           <w:rPr>
@@ -1820,7 +1826,7 @@
           <w14:ligatures w14:val="standardContextual"/>
         </w:rPr>
       </w:pPr>
-      <w:hyperlink w:anchor="_Toc242172363" w:history="1">
+      <w:hyperlink w:anchor="_Toc244091347" w:history="1">
         <w:r>
           <w:rPr>
             <w:rStyle w:val="ab"/>
@@ -1871,7 +1877,7 @@
             <w:noProof/>
             <w:webHidden/>
           </w:rPr>
-          <w:instrText xml:space="preserve"> PAGEREF _Toc242172363 \h </w:instrText>
+          <w:instrText xml:space="preserve"> PAGEREF _Toc244091347 \h </w:instrText>
         </w:r>
         <w:r>
           <w:rPr>
@@ -1916,7 +1922,7 @@
           <w14:ligatures w14:val="standardContextual"/>
         </w:rPr>
       </w:pPr>
-      <w:hyperlink w:anchor="_Toc242172364" w:history="1">
+      <w:hyperlink w:anchor="_Toc244091348" w:history="1">
         <w:r>
           <w:rPr>
             <w:rStyle w:val="ab"/>
@@ -1966,7 +1972,7 @@
             <w:noProof/>
             <w:webHidden/>
           </w:rPr>
-          <w:instrText xml:space="preserve"> PAGEREF _Toc242172364 \h </w:instrText>
+          <w:instrText xml:space="preserve"> PAGEREF _Toc244091348 \h </w:instrText>
         </w:r>
         <w:r>
           <w:rPr>
@@ -2011,7 +2017,7 @@
           <w14:ligatures w14:val="standardContextual"/>
         </w:rPr>
       </w:pPr>
-      <w:hyperlink w:anchor="_Toc242172365" w:history="1">
+      <w:hyperlink w:anchor="_Toc244091349" w:history="1">
         <w:r>
           <w:rPr>
             <w:rStyle w:val="ab"/>
@@ -2054,7 +2060,7 @@
             <w:noProof/>
             <w:webHidden/>
           </w:rPr>
-          <w:instrText xml:space="preserve"> PAGEREF _Toc242172365 \h </w:instrText>
+          <w:instrText xml:space="preserve"> PAGEREF _Toc244091349 \h </w:instrText>
         </w:r>
         <w:r>
           <w:rPr>
@@ -2099,7 +2105,7 @@
           <w14:ligatures w14:val="standardContextual"/>
         </w:rPr>
       </w:pPr>
-      <w:hyperlink w:anchor="_Toc242172366" w:history="1">
+      <w:hyperlink w:anchor="_Toc244091350" w:history="1">
         <w:r>
           <w:rPr>
             <w:rStyle w:val="ab"/>
@@ -2142,7 +2148,7 @@
             <w:noProof/>
             <w:webHidden/>
           </w:rPr>
-          <w:instrText xml:space="preserve"> PAGEREF _Toc242172366 \h </w:instrText>
+          <w:instrText xml:space="preserve"> PAGEREF _Toc244091350 \h </w:instrText>
         </w:r>
         <w:r>
           <w:rPr>
@@ -2188,7 +2194,7 @@
           <w14:ligatures w14:val="standardContextual"/>
         </w:rPr>
       </w:pPr>
-      <w:hyperlink w:anchor="_Toc242172367" w:history="1">
+      <w:hyperlink w:anchor="_Toc244091351" w:history="1">
         <w:r>
           <w:rPr>
             <w:rStyle w:val="ab"/>
@@ -2232,7 +2238,7 @@
             <w:noProof/>
             <w:webHidden/>
           </w:rPr>
-          <w:instrText xml:space="preserve"> PAGEREF _Toc242172367 \h </w:instrText>
+          <w:instrText xml:space="preserve"> PAGEREF _Toc244091351 \h </w:instrText>
         </w:r>
         <w:r>
           <w:rPr>
@@ -2278,7 +2284,7 @@
           <w14:ligatures w14:val="standardContextual"/>
         </w:rPr>
       </w:pPr>
-      <w:hyperlink w:anchor="_Toc242172368" w:history="1">
+      <w:hyperlink w:anchor="_Toc244091352" w:history="1">
         <w:r>
           <w:rPr>
             <w:rStyle w:val="ab"/>
@@ -2322,7 +2328,7 @@
             <w:noProof/>
             <w:webHidden/>
           </w:rPr>
-          <w:instrText xml:space="preserve"> PAGEREF _Toc242172368 \h </w:instrText>
+          <w:instrText xml:space="preserve"> PAGEREF _Toc244091352 \h </w:instrText>
         </w:r>
         <w:r>
           <w:rPr>
@@ -2367,7 +2373,7 @@
           <w14:ligatures w14:val="standardContextual"/>
         </w:rPr>
       </w:pPr>
-      <w:hyperlink w:anchor="_Toc242172369" w:history="1">
+      <w:hyperlink w:anchor="_Toc244091353" w:history="1">
         <w:r>
           <w:rPr>
             <w:rStyle w:val="ab"/>
@@ -2410,7 +2416,7 @@
             <w:noProof/>
             <w:webHidden/>
           </w:rPr>
-          <w:instrText xml:space="preserve"> PAGEREF _Toc242172369 \h </w:instrText>
+          <w:instrText xml:space="preserve"> PAGEREF _Toc244091353 \h </w:instrText>
         </w:r>
         <w:r>
           <w:rPr>
@@ -2455,7 +2461,7 @@
           <w14:ligatures w14:val="standardContextual"/>
         </w:rPr>
       </w:pPr>
-      <w:hyperlink w:anchor="_Toc242172370" w:history="1">
+      <w:hyperlink w:anchor="_Toc244091354" w:history="1">
         <w:r>
           <w:rPr>
             <w:rStyle w:val="ab"/>
@@ -2498,7 +2504,7 @@
             <w:noProof/>
             <w:webHidden/>
           </w:rPr>
-          <w:instrText xml:space="preserve"> PAGEREF _Toc242172370 \h </w:instrText>
+          <w:instrText xml:space="preserve"> PAGEREF _Toc244091354 \h </w:instrText>
         </w:r>
         <w:r>
           <w:rPr>
@@ -2544,7 +2550,7 @@
           <w14:ligatures w14:val="standardContextual"/>
         </w:rPr>
       </w:pPr>
-      <w:hyperlink w:anchor="_Toc242172371" w:history="1">
+      <w:hyperlink w:anchor="_Toc244091355" w:history="1">
         <w:r>
           <w:rPr>
             <w:rStyle w:val="ab"/>
@@ -2588,7 +2594,7 @@
             <w:noProof/>
             <w:webHidden/>
           </w:rPr>
-          <w:instrText xml:space="preserve"> PAGEREF _Toc242172371 \h </w:instrText>
+          <w:instrText xml:space="preserve"> PAGEREF _Toc244091355 \h </w:instrText>
         </w:r>
         <w:r>
           <w:rPr>
@@ -2633,7 +2639,7 @@
           <w14:ligatures w14:val="standardContextual"/>
         </w:rPr>
       </w:pPr>
-      <w:hyperlink w:anchor="_Toc242172372" w:history="1">
+      <w:hyperlink w:anchor="_Toc244091356" w:history="1">
         <w:r>
           <w:rPr>
             <w:rStyle w:val="ab"/>
@@ -2676,7 +2682,7 @@
             <w:noProof/>
             <w:webHidden/>
           </w:rPr>
-          <w:instrText xml:space="preserve"> PAGEREF _Toc242172372 \h </w:instrText>
+          <w:instrText xml:space="preserve"> PAGEREF _Toc244091356 \h </w:instrText>
         </w:r>
         <w:r>
           <w:rPr>
@@ -2721,7 +2727,7 @@
           <w14:ligatures w14:val="standardContextual"/>
         </w:rPr>
       </w:pPr>
-      <w:hyperlink w:anchor="_Toc242172373" w:history="1">
+      <w:hyperlink w:anchor="_Toc244091357" w:history="1">
         <w:r>
           <w:rPr>
             <w:rStyle w:val="ab"/>
@@ -2764,7 +2770,7 @@
             <w:noProof/>
             <w:webHidden/>
           </w:rPr>
-          <w:instrText xml:space="preserve"> PAGEREF _Toc242172373 \h </w:instrText>
+          <w:instrText xml:space="preserve"> PAGEREF _Toc244091357 \h </w:instrText>
         </w:r>
         <w:r>
           <w:rPr>
@@ -2809,7 +2815,7 @@
           <w14:ligatures w14:val="standardContextual"/>
         </w:rPr>
       </w:pPr>
-      <w:hyperlink w:anchor="_Toc242172374" w:history="1">
+      <w:hyperlink w:anchor="_Toc244091358" w:history="1">
         <w:r>
           <w:rPr>
             <w:rStyle w:val="ab"/>
@@ -2852,7 +2858,7 @@
             <w:noProof/>
             <w:webHidden/>
           </w:rPr>
-          <w:instrText xml:space="preserve"> PAGEREF _Toc242172374 \h </w:instrText>
+          <w:instrText xml:space="preserve"> PAGEREF _Toc244091358 \h </w:instrText>
         </w:r>
         <w:r>
           <w:rPr>
@@ -2897,7 +2903,7 @@
           <w14:ligatures w14:val="standardContextual"/>
         </w:rPr>
       </w:pPr>
-      <w:hyperlink w:anchor="_Toc242172375" w:history="1">
+      <w:hyperlink w:anchor="_Toc244091359" w:history="1">
         <w:r>
           <w:rPr>
             <w:rStyle w:val="ab"/>
@@ -2940,7 +2946,7 @@
             <w:noProof/>
             <w:webHidden/>
           </w:rPr>
-          <w:instrText xml:space="preserve"> PAGEREF _Toc242172375 \h </w:instrText>
+          <w:instrText xml:space="preserve"> PAGEREF _Toc244091359 \h </w:instrText>
         </w:r>
         <w:r>
           <w:rPr>
@@ -2985,7 +2991,7 @@
           <w14:ligatures w14:val="standardContextual"/>
         </w:rPr>
       </w:pPr>
-      <w:hyperlink w:anchor="_Toc242172376" w:history="1">
+      <w:hyperlink w:anchor="_Toc244091360" w:history="1">
         <w:r>
           <w:rPr>
             <w:rStyle w:val="ab"/>
@@ -3028,7 +3034,7 @@
             <w:noProof/>
             <w:webHidden/>
           </w:rPr>
-          <w:instrText xml:space="preserve"> PAGEREF _Toc242172376 \h </w:instrText>
+          <w:instrText xml:space="preserve"> PAGEREF _Toc244091360 \h </w:instrText>
         </w:r>
         <w:r>
           <w:rPr>
@@ -3074,7 +3080,7 @@
           <w14:ligatures w14:val="standardContextual"/>
         </w:rPr>
       </w:pPr>
-      <w:hyperlink w:anchor="_Toc242172377" w:history="1">
+      <w:hyperlink w:anchor="_Toc244091361" w:history="1">
         <w:r>
           <w:rPr>
             <w:rStyle w:val="ab"/>
@@ -3118,7 +3124,7 @@
             <w:noProof/>
             <w:webHidden/>
           </w:rPr>
-          <w:instrText xml:space="preserve"> PAGEREF _Toc242172377 \h </w:instrText>
+          <w:instrText xml:space="preserve"> PAGEREF _Toc244091361 \h </w:instrText>
         </w:r>
         <w:r>
           <w:rPr>
@@ -3164,7 +3170,7 @@
           <w14:ligatures w14:val="standardContextual"/>
         </w:rPr>
       </w:pPr>
-      <w:hyperlink w:anchor="_Toc242172378" w:history="1">
+      <w:hyperlink w:anchor="_Toc244091362" w:history="1">
         <w:r>
           <w:rPr>
             <w:rStyle w:val="ab"/>
@@ -3208,7 +3214,7 @@
             <w:noProof/>
             <w:webHidden/>
           </w:rPr>
-          <w:instrText xml:space="preserve"> PAGEREF _Toc242172378 \h </w:instrText>
+          <w:instrText xml:space="preserve"> PAGEREF _Toc244091362 \h </w:instrText>
         </w:r>
         <w:r>
           <w:rPr>
@@ -3269,7 +3275,7 @@
       <w:pPr>
         <w:pStyle w:val="1"/>
       </w:pPr>
-      <w:bookmarkStart w:id="0" w:name="_Toc242172361"/>
+      <w:bookmarkStart w:id="0" w:name="_Toc244091345"/>
       <w:r>
         <w:rPr>
           <w:rFonts w:hint="eastAsia"/>
@@ -3567,7 +3573,7 @@
       <w:pPr>
         <w:pStyle w:val="1"/>
       </w:pPr>
-      <w:bookmarkStart w:id="1" w:name="_Toc242172362"/>
+      <w:bookmarkStart w:id="1" w:name="_Toc244091346"/>
       <w:r>
         <w:rPr>
           <w:rFonts w:hint="eastAsia"/>
@@ -4238,12 +4244,12 @@
         </w:rPr>
         <w:t>アクション</w:t>
       </w:r>
-      <w:r>
-        <w:rPr>
-          <w:b/>
-        </w:rPr>
-        <w:br/>
-      </w:r>
+    </w:p>
+    <w:p>
+      <w:pPr>
+        <w:pStyle w:val="af0"/>
+        <w:ind w:leftChars="0" w:left="420"/>
+      </w:pPr>
       <w:r>
         <w:rPr>
           <w:rFonts w:hint="eastAsia"/>
@@ -4351,12 +4357,12 @@
         </w:rPr>
         <w:t>グラフ</w:t>
       </w:r>
-      <w:r>
-        <w:rPr>
-          <w:b/>
-        </w:rPr>
-        <w:br/>
-      </w:r>
+    </w:p>
+    <w:p>
+      <w:pPr>
+        <w:pStyle w:val="af0"/>
+        <w:ind w:leftChars="0" w:left="420"/>
+      </w:pPr>
       <w:r>
         <w:rPr>
           <w:rFonts w:hint="eastAsia"/>
@@ -4383,7 +4389,7 @@
       <w:pPr>
         <w:pStyle w:val="1"/>
       </w:pPr>
-      <w:bookmarkStart w:id="2" w:name="_Toc242172363"/>
+      <w:bookmarkStart w:id="2" w:name="_Toc244091347"/>
       <w:r>
         <w:rPr>
           <w:rFonts w:hint="eastAsia"/>
@@ -4614,7 +4620,7 @@
       <w:pPr>
         <w:pStyle w:val="2"/>
       </w:pPr>
-      <w:bookmarkStart w:id="3" w:name="_Toc242172364"/>
+      <w:bookmarkStart w:id="3" w:name="_Toc244091348"/>
       <w:r>
         <w:rPr>
           <w:rFonts w:hint="eastAsia"/>
@@ -4688,7 +4694,7 @@
       <w:pPr>
         <w:pStyle w:val="2"/>
       </w:pPr>
-      <w:bookmarkStart w:id="4" w:name="_Toc242172365"/>
+      <w:bookmarkStart w:id="4" w:name="_Toc244091349"/>
       <w:r>
         <w:rPr>
           <w:rFonts w:hint="eastAsia"/>
@@ -4828,7 +4834,7 @@
           <w:noProof/>
         </w:rPr>
         <w:drawing>
-          <wp:inline distT="0" distB="0" distL="0" distR="0" wp14:anchorId="2007A317" wp14:editId="4D052BCC">
+          <wp:inline distT="0" distB="0" distL="0" distR="0" wp14:anchorId="2007A317" wp14:editId="68152AD6">
             <wp:extent cx="5394960" cy="2631876"/>
             <wp:effectExtent l="0" t="0" r="0" b="0"/>
             <wp:docPr id="2" name="図 2"/>
@@ -5330,9 +5336,9 @@
         <w:pStyle w:val="2"/>
       </w:pPr>
       <w:bookmarkStart w:id="5" w:name="_Toc288747699"/>
-      <w:bookmarkStart w:id="6" w:name="_Toc242172366"/>
-      <w:bookmarkStart w:id="7" w:name="OLE_LINK12"/>
-      <w:bookmarkStart w:id="8" w:name="OLE_LINK2"/>
+      <w:bookmarkStart w:id="6" w:name="OLE_LINK12"/>
+      <w:bookmarkStart w:id="7" w:name="OLE_LINK2"/>
+      <w:bookmarkStart w:id="8" w:name="_Toc244091350"/>
       <w:r>
         <w:rPr>
           <w:rFonts w:hint="eastAsia"/>
@@ -5340,7 +5346,7 @@
         <w:t>最新データの閲覧</w:t>
       </w:r>
       <w:bookmarkEnd w:id="5"/>
-      <w:bookmarkEnd w:id="6"/>
+      <w:bookmarkEnd w:id="8"/>
     </w:p>
     <w:p>
       <w:pPr>
@@ -5398,7 +5404,7 @@
       <w:pPr>
         <w:pStyle w:val="3"/>
       </w:pPr>
-      <w:bookmarkStart w:id="9" w:name="_Toc242172367"/>
+      <w:bookmarkStart w:id="9" w:name="_Toc244091351"/>
       <w:r>
         <w:rPr>
           <w:rFonts w:hint="eastAsia"/>
@@ -5430,7 +5436,7 @@
         </w:rPr>
         <w:lastRenderedPageBreak/>
         <w:drawing>
-          <wp:inline distT="0" distB="0" distL="0" distR="0" wp14:anchorId="3B8ACCCD" wp14:editId="4633D1D1">
+          <wp:inline distT="0" distB="0" distL="0" distR="0" wp14:anchorId="3B8ACCCD" wp14:editId="14FDCFAF">
             <wp:extent cx="4709160" cy="2445512"/>
             <wp:effectExtent l="0" t="0" r="0" b="0"/>
             <wp:docPr id="3" name="図 3"/>
@@ -5641,7 +5647,7 @@
           <w:noProof/>
         </w:rPr>
         <w:drawing>
-          <wp:inline distT="0" distB="0" distL="0" distR="0" wp14:anchorId="5EC75DE1" wp14:editId="4D90C71F">
+          <wp:inline distT="0" distB="0" distL="0" distR="0" wp14:anchorId="5EC75DE1" wp14:editId="3F3FFDF1">
             <wp:extent cx="4823460" cy="1897227"/>
             <wp:effectExtent l="0" t="0" r="0" b="8255"/>
             <wp:docPr id="4" name="図 4"/>
@@ -6092,7 +6098,7 @@
       <w:pPr>
         <w:pStyle w:val="3"/>
       </w:pPr>
-      <w:bookmarkStart w:id="10" w:name="_Toc242172368"/>
+      <w:bookmarkStart w:id="10" w:name="_Toc244091352"/>
       <w:r>
         <w:rPr>
           <w:rFonts w:hint="eastAsia"/>
@@ -6424,7 +6430,7 @@
           <w:noProof/>
         </w:rPr>
         <w:drawing>
-          <wp:inline distT="0" distB="0" distL="0" distR="0" wp14:anchorId="55FEEF1C" wp14:editId="3F1CC3D0">
+          <wp:inline distT="0" distB="0" distL="0" distR="0" wp14:anchorId="55FEEF1C" wp14:editId="4B48B476">
             <wp:extent cx="4709160" cy="2269660"/>
             <wp:effectExtent l="0" t="0" r="0" b="0"/>
             <wp:docPr id="6" name="図 6"/>
@@ -6606,8 +6612,8 @@
         <w:pStyle w:val="2"/>
       </w:pPr>
       <w:bookmarkStart w:id="11" w:name="_Toc288747700"/>
-      <w:bookmarkStart w:id="12" w:name="_Toc242172369"/>
-      <w:bookmarkEnd w:id="7"/>
+      <w:bookmarkStart w:id="12" w:name="_Toc244091353"/>
+      <w:bookmarkEnd w:id="6"/>
       <w:r>
         <w:rPr>
           <w:rFonts w:hint="eastAsia"/>
@@ -8127,7 +8133,7 @@
         <w:pStyle w:val="2"/>
       </w:pPr>
       <w:bookmarkStart w:id="14" w:name="_Toc288747701"/>
-      <w:bookmarkStart w:id="15" w:name="_Toc242172370"/>
+      <w:bookmarkStart w:id="15" w:name="_Toc244091354"/>
       <w:r>
         <w:rPr>
           <w:rFonts w:hint="eastAsia"/>
@@ -8272,7 +8278,7 @@
           <w:noProof/>
         </w:rPr>
         <w:drawing>
-          <wp:inline distT="0" distB="0" distL="0" distR="0" wp14:anchorId="3DD533B0" wp14:editId="15642CF1">
+          <wp:inline distT="0" distB="0" distL="0" distR="0" wp14:anchorId="3DD533B0" wp14:editId="184C89A1">
             <wp:extent cx="4823460" cy="2471034"/>
             <wp:effectExtent l="0" t="0" r="0" b="5715"/>
             <wp:docPr id="11" name="図 11"/>
@@ -8618,7 +8624,7 @@
         <w:t>件分の発生履歴が表示される。</w:t>
       </w:r>
     </w:p>
-    <w:bookmarkEnd w:id="8"/>
+    <w:bookmarkEnd w:id="7"/>
     <w:p>
       <w:r>
         <w:br w:type="page"/>
@@ -8629,7 +8635,7 @@
         <w:pStyle w:val="1"/>
       </w:pPr>
       <w:bookmarkStart w:id="16" w:name="_Ref316507324"/>
-      <w:bookmarkStart w:id="17" w:name="_Toc242172371"/>
+      <w:bookmarkStart w:id="17" w:name="_Toc244091355"/>
       <w:r>
         <w:rPr>
           <w:rFonts w:hint="eastAsia"/>
@@ -8870,7 +8876,7 @@
         <w:pStyle w:val="2"/>
       </w:pPr>
       <w:bookmarkStart w:id="18" w:name="_Toc288747673"/>
-      <w:bookmarkStart w:id="19" w:name="_Toc242172372"/>
+      <w:bookmarkStart w:id="19" w:name="_Toc244091356"/>
       <w:r>
         <w:rPr>
           <w:rFonts w:hint="eastAsia"/>
@@ -9077,7 +9083,7 @@
           <w:noProof/>
         </w:rPr>
         <w:drawing>
-          <wp:inline distT="0" distB="0" distL="0" distR="0" wp14:anchorId="5A3ADB08" wp14:editId="2FFCEEDC">
+          <wp:inline distT="0" distB="0" distL="0" distR="0" wp14:anchorId="5A3ADB08" wp14:editId="6558BCB6">
             <wp:extent cx="5381375" cy="2171700"/>
             <wp:effectExtent l="0" t="0" r="0" b="0"/>
             <wp:docPr id="16" name="図 16"/>
@@ -10863,7 +10869,15 @@
                 <w:sz w:val="20"/>
                 <w:szCs w:val="20"/>
               </w:rPr>
-              <w:t>デバックモードの可否を設定する。</w:t>
+              <w:t>デバッグ</w:t>
+            </w:r>
+            <w:r>
+              <w:rPr>
+                <w:rFonts w:hint="eastAsia"/>
+                <w:sz w:val="20"/>
+                <w:szCs w:val="20"/>
+              </w:rPr>
+              <w:t>モードの可否を設定する。</w:t>
             </w:r>
           </w:p>
         </w:tc>
@@ -11075,7 +11089,7 @@
         <w:pStyle w:val="2"/>
       </w:pPr>
       <w:bookmarkStart w:id="21" w:name="_Toc288747674"/>
-      <w:bookmarkStart w:id="22" w:name="_Toc242172373"/>
+      <w:bookmarkStart w:id="22" w:name="_Toc244091357"/>
       <w:r>
         <w:rPr>
           <w:rFonts w:hint="eastAsia"/>
@@ -11158,7 +11172,7 @@
           <w:noProof/>
         </w:rPr>
         <w:drawing>
-          <wp:inline distT="0" distB="0" distL="0" distR="0" wp14:anchorId="350AB484" wp14:editId="30831658">
+          <wp:inline distT="0" distB="0" distL="0" distR="0" wp14:anchorId="350AB484" wp14:editId="2E35E9D8">
             <wp:extent cx="5349904" cy="2159000"/>
             <wp:effectExtent l="0" t="0" r="3175" b="0"/>
             <wp:docPr id="1" name="図 1"/>
@@ -11398,7 +11412,7 @@
         <w:pStyle w:val="2"/>
       </w:pPr>
       <w:bookmarkStart w:id="23" w:name="_Toc288747675"/>
-      <w:bookmarkStart w:id="24" w:name="_Toc242172374"/>
+      <w:bookmarkStart w:id="24" w:name="_Toc244091358"/>
       <w:r>
         <w:rPr>
           <w:rFonts w:hint="eastAsia"/>
@@ -14891,7 +14905,7 @@
         <w:pStyle w:val="2"/>
       </w:pPr>
       <w:bookmarkStart w:id="26" w:name="_Toc288747676"/>
-      <w:bookmarkStart w:id="27" w:name="_Toc242172375"/>
+      <w:bookmarkStart w:id="27" w:name="_Toc244091359"/>
       <w:r>
         <w:rPr>
           <w:rFonts w:hint="eastAsia"/>
@@ -15051,7 +15065,7 @@
       <w:pPr>
         <w:pStyle w:val="2"/>
       </w:pPr>
-      <w:bookmarkStart w:id="28" w:name="_Toc242172376"/>
+      <w:bookmarkStart w:id="28" w:name="_Toc244091360"/>
       <w:r>
         <w:rPr>
           <w:rFonts w:hint="eastAsia"/>
@@ -15161,7 +15175,7 @@
         </w:rPr>
         <w:lastRenderedPageBreak/>
         <w:drawing>
-          <wp:inline distT="0" distB="0" distL="0" distR="0" wp14:anchorId="310BFBA7" wp14:editId="5811735A">
+          <wp:inline distT="0" distB="0" distL="0" distR="0" wp14:anchorId="310BFBA7" wp14:editId="65955DA2">
             <wp:extent cx="4222206" cy="1409700"/>
             <wp:effectExtent l="0" t="0" r="6985" b="0"/>
             <wp:docPr id="24" name="図 24"/>
@@ -15695,7 +15709,7 @@
       <w:bookmarkStart w:id="32" w:name="_メール通知設定"/>
       <w:bookmarkStart w:id="33" w:name="_Ref396730546"/>
       <w:bookmarkStart w:id="34" w:name="_Ref396730548"/>
-      <w:bookmarkStart w:id="35" w:name="_Toc242172377"/>
+      <w:bookmarkStart w:id="35" w:name="_Toc244091361"/>
       <w:bookmarkEnd w:id="32"/>
       <w:r>
         <w:rPr>
@@ -16053,7 +16067,7 @@
           <w:noProof/>
         </w:rPr>
         <w:drawing>
-          <wp:inline distT="0" distB="0" distL="0" distR="0" wp14:anchorId="5C5DB4D8" wp14:editId="0C313D83">
+          <wp:inline distT="0" distB="0" distL="0" distR="0" wp14:anchorId="5C5DB4D8" wp14:editId="70DCE6F6">
             <wp:extent cx="5781118" cy="2305050"/>
             <wp:effectExtent l="0" t="0" r="0" b="0"/>
             <wp:docPr id="21" name="図 21"/>
@@ -18023,7 +18037,7 @@
         </w:rPr>
         <w:lastRenderedPageBreak/>
         <w:drawing>
-          <wp:inline distT="0" distB="0" distL="0" distR="0" wp14:anchorId="76B060CF" wp14:editId="109701EB">
+          <wp:inline distT="0" distB="0" distL="0" distR="0" wp14:anchorId="76B060CF" wp14:editId="10F3B7BF">
             <wp:extent cx="5143341" cy="1784350"/>
             <wp:effectExtent l="0" t="0" r="635" b="6350"/>
             <wp:docPr id="53" name="図 53"/>
@@ -20770,7 +20784,7 @@
       <w:pPr>
         <w:pStyle w:val="1"/>
       </w:pPr>
-      <w:bookmarkStart w:id="36" w:name="_Toc242172378"/>
+      <w:bookmarkStart w:id="36" w:name="_Toc244091362"/>
       <w:r>
         <w:rPr>
           <w:rFonts w:hint="eastAsia"/>
@@ -21136,7 +21150,7 @@
           <w:rFonts w:hint="eastAsia"/>
           <w:szCs w:val="21"/>
         </w:rPr>
-        <w:t xml:space="preserve"> (</w:t>
+        <w:t>（</w:t>
       </w:r>
       <w:r>
         <w:rPr>
@@ -21150,13 +21164,7 @@
           <w:rFonts w:hint="eastAsia"/>
           <w:szCs w:val="21"/>
         </w:rPr>
-        <w:t>)</w:t>
-      </w:r>
-      <w:r>
-        <w:rPr>
-          <w:szCs w:val="21"/>
-        </w:rPr>
-        <w:t xml:space="preserve"> </w:t>
+        <w:t>）</w:t>
       </w:r>
       <w:r>
         <w:rPr>
@@ -21193,7 +21201,7 @@
           <w:rFonts w:hint="eastAsia"/>
           <w:szCs w:val="21"/>
         </w:rPr>
-        <w:t xml:space="preserve"> (</w:t>
+        <w:t>（</w:t>
       </w:r>
       <w:r>
         <w:rPr>
@@ -21207,139 +21215,127 @@
           <w:rFonts w:hint="eastAsia"/>
           <w:szCs w:val="21"/>
         </w:rPr>
-        <w:t>)</w:t>
-      </w:r>
-      <w:r>
-        <w:rPr>
+        <w:t>）</w:t>
+      </w:r>
+      <w:r>
+        <w:rPr>
+          <w:rFonts w:hint="eastAsia"/>
           <w:szCs w:val="21"/>
         </w:rPr>
+        <w:t>を停止し</w:t>
+      </w:r>
+      <w:r>
+        <w:rPr>
+          <w:rFonts w:hint="eastAsia"/>
+          <w:szCs w:val="21"/>
+        </w:rPr>
+        <w:t>た後、</w:t>
+      </w:r>
+      <w:r>
+        <w:rPr>
+          <w:rFonts w:hint="eastAsia"/>
+          <w:szCs w:val="21"/>
+        </w:rPr>
+        <w:t>フェイルオーバ</w:t>
+      </w:r>
+      <w:r>
+        <w:rPr>
+          <w:szCs w:val="21"/>
+        </w:rPr>
+        <w:t>スクリプトを</w:t>
+      </w:r>
+      <w:r>
+        <w:rPr>
+          <w:rFonts w:hint="eastAsia"/>
+          <w:szCs w:val="21"/>
+        </w:rPr>
         <w:t xml:space="preserve"> </w:t>
       </w:r>
       <w:r>
         <w:rPr>
-          <w:rFonts w:hint="eastAsia"/>
           <w:szCs w:val="21"/>
         </w:rPr>
-        <w:t>を停止し</w:t>
+        <w:t>–</w:t>
       </w:r>
       <w:r>
         <w:rPr>
           <w:rFonts w:hint="eastAsia"/>
           <w:szCs w:val="21"/>
         </w:rPr>
-        <w:t>た後、</w:t>
+        <w:t>t</w:t>
       </w:r>
       <w:r>
         <w:rPr>
           <w:rFonts w:hint="eastAsia"/>
           <w:szCs w:val="21"/>
         </w:rPr>
-        <w:t>フェイルオーバ</w:t>
-      </w:r>
-      <w:r>
-        <w:rPr>
+        <w:t>オプション</w:t>
+      </w:r>
+      <w:r>
+        <w:rPr>
+          <w:rFonts w:hint="eastAsia"/>
           <w:szCs w:val="21"/>
         </w:rPr>
-        <w:t>スクリプトを</w:t>
+        <w:t>（</w:t>
       </w:r>
       <w:r>
         <w:rPr>
           <w:rFonts w:hint="eastAsia"/>
           <w:szCs w:val="21"/>
         </w:rPr>
-        <w:t xml:space="preserve"> </w:t>
-      </w:r>
-      <w:r>
-        <w:rPr>
+        <w:t>テストモード</w:t>
+      </w:r>
+      <w:r>
+        <w:rPr>
+          <w:rFonts w:hint="eastAsia"/>
           <w:szCs w:val="21"/>
         </w:rPr>
-        <w:t>–</w:t>
+        <w:t>）</w:t>
       </w:r>
       <w:r>
         <w:rPr>
           <w:rFonts w:hint="eastAsia"/>
           <w:szCs w:val="21"/>
         </w:rPr>
-        <w:t>t</w:t>
-      </w:r>
-      <w:r>
-        <w:rPr>
-          <w:rFonts w:hint="eastAsia"/>
+        <w:t>を付けて</w:t>
+      </w:r>
+      <w:r>
+        <w:rPr>
           <w:szCs w:val="21"/>
         </w:rPr>
-        <w:t>オプション</w:t>
+        <w:t>実行し、</w:t>
       </w:r>
       <w:r>
         <w:rPr>
           <w:rFonts w:hint="eastAsia"/>
           <w:szCs w:val="21"/>
         </w:rPr>
-        <w:t xml:space="preserve"> </w:t>
+        <w:t>メッセージ</w:t>
       </w:r>
       <w:r>
         <w:rPr>
           <w:szCs w:val="21"/>
         </w:rPr>
-        <w:t>(</w:t>
+        <w:t>を確認</w:t>
       </w:r>
       <w:r>
         <w:rPr>
           <w:rFonts w:hint="eastAsia"/>
           <w:szCs w:val="21"/>
         </w:rPr>
-        <w:t>テストモード</w:t>
-      </w:r>
-      <w:r>
-        <w:rPr>
-          <w:rFonts w:hint="eastAsia"/>
+        <w:t>する。「</w:t>
+      </w:r>
+      <w:r>
+        <w:rPr>
           <w:szCs w:val="21"/>
         </w:rPr>
-        <w:t xml:space="preserve">) </w:t>
-      </w:r>
-      <w:r>
-        <w:rPr>
-          <w:rFonts w:hint="eastAsia"/>
+        <w:t>suitable candidate for master gfmd is</w:t>
+      </w:r>
+      <w:r>
+        <w:rPr>
           <w:szCs w:val="21"/>
         </w:rPr>
-        <w:t>を付けて</w:t>
-      </w:r>
-      <w:r>
-        <w:rPr>
-          <w:szCs w:val="21"/>
-        </w:rPr>
-        <w:t>実行し、</w:t>
-      </w:r>
-      <w:r>
-        <w:rPr>
-          <w:rFonts w:hint="eastAsia"/>
-          <w:szCs w:val="21"/>
-        </w:rPr>
-        <w:t>メッセージ</w:t>
-      </w:r>
-      <w:r>
-        <w:rPr>
-          <w:szCs w:val="21"/>
-        </w:rPr>
-        <w:t>を確認</w:t>
-      </w:r>
-      <w:r>
-        <w:rPr>
-          <w:rFonts w:hint="eastAsia"/>
-          <w:szCs w:val="21"/>
-        </w:rPr>
-        <w:t>する。「</w:t>
-      </w:r>
-      <w:r>
-        <w:rPr>
-          <w:szCs w:val="21"/>
-        </w:rPr>
-        <w:t>suitable candidate for master gfmd is</w:t>
-      </w:r>
-      <w:r>
-        <w:rPr>
-          <w:szCs w:val="21"/>
-        </w:rPr>
-        <w:t>…</w:t>
+        <w:t xml:space="preserve"> ...</w:t>
       </w:r>
       <w:r>
         <w:rPr>
@@ -21514,43 +21510,22 @@
         <w:rPr>
           <w:rFonts w:hint="eastAsia"/>
         </w:rPr>
-        <w:t>自動フェイルオーバ</w:t>
-      </w:r>
-      <w:r>
-        <w:t>を</w:t>
-      </w:r>
-      <w:r>
-        <w:rPr>
-          <w:rFonts w:hint="eastAsia"/>
-        </w:rPr>
-        <w:t>、</w:t>
-      </w:r>
-      <w:r>
-        <w:t>今度は</w:t>
-      </w:r>
-      <w:r>
-        <w:rPr>
-          <w:rFonts w:hint="eastAsia"/>
-        </w:rPr>
-        <w:t xml:space="preserve"> </w:t>
-      </w:r>
-      <w:r>
-        <w:t>–</w:t>
-      </w:r>
-      <w:r>
-        <w:rPr>
-          <w:rFonts w:hint="eastAsia"/>
-        </w:rPr>
-        <w:t xml:space="preserve">t </w:t>
-      </w:r>
-      <w:r>
-        <w:rPr>
-          <w:rFonts w:hint="eastAsia"/>
-        </w:rPr>
-        <w:t>オプション</w:t>
-      </w:r>
-      <w:r>
-        <w:t>無しで実行する。</w:t>
+        <w:t>フェイルオーバスクリプトを、今度は</w:t>
+      </w:r>
+      <w:r>
+        <w:rPr>
+          <w:rFonts w:hint="eastAsia"/>
+        </w:rPr>
+        <w:t xml:space="preserve"> -t </w:t>
+      </w:r>
+      <w:r>
+        <w:rPr>
+          <w:rFonts w:hint="eastAsia"/>
+        </w:rPr>
+        <w:t>オプションなしで実行する</w:t>
+      </w:r>
+      <w:r>
+        <w:t>。</w:t>
       </w:r>
       <w:r>
         <w:rPr>

</xml_diff>